<commit_message>
Copy files from OS-LAB
</commit_message>
<xml_diff>
--- a/OS LAB2.docx
+++ b/OS LAB2.docx
@@ -169,6 +169,9 @@
     </w:p>
     <w:p>
       <w:r>
+        <w:rPr>
+          <w:noProof/>
+        </w:rPr>
         <w:drawing>
           <wp:inline distT="0" distB="0" distL="0" distR="0" wp14:anchorId="14C52DBB" wp14:editId="6E1710D2">
             <wp:extent cx="6645910" cy="1401445"/>
@@ -208,6 +211,9 @@
     </w:p>
     <w:p>
       <w:r>
+        <w:rPr>
+          <w:noProof/>
+        </w:rPr>
         <w:drawing>
           <wp:inline distT="0" distB="0" distL="0" distR="0" wp14:anchorId="202242EA" wp14:editId="27E15972">
             <wp:extent cx="6645910" cy="1490980"/>
@@ -247,7 +253,9 @@
     </w:p>
     <w:p>
       <w:r>
-        <w:lastRenderedPageBreak/>
+        <w:rPr>
+          <w:noProof/>
+        </w:rPr>
         <w:drawing>
           <wp:inline distT="0" distB="0" distL="0" distR="0" wp14:anchorId="7CBFDAFD" wp14:editId="27EDAEED">
             <wp:extent cx="6645910" cy="1406525"/>
@@ -287,6 +295,9 @@
     </w:p>
     <w:p>
       <w:r>
+        <w:rPr>
+          <w:noProof/>
+        </w:rPr>
         <w:drawing>
           <wp:inline distT="0" distB="0" distL="0" distR="0" wp14:anchorId="4A629F15" wp14:editId="0D002952">
             <wp:extent cx="6645910" cy="1878330"/>
@@ -326,6 +337,9 @@
     </w:p>
     <w:p>
       <w:r>
+        <w:rPr>
+          <w:noProof/>
+        </w:rPr>
         <w:drawing>
           <wp:inline distT="0" distB="0" distL="0" distR="0" wp14:anchorId="6B670615" wp14:editId="0DFE7887">
             <wp:extent cx="6645910" cy="1916430"/>
@@ -365,6 +379,9 @@
     </w:p>
     <w:p>
       <w:r>
+        <w:rPr>
+          <w:noProof/>
+        </w:rPr>
         <w:drawing>
           <wp:inline distT="0" distB="0" distL="0" distR="0" wp14:anchorId="2AE05828" wp14:editId="74E66029">
             <wp:extent cx="6645910" cy="1826260"/>
@@ -404,6 +421,9 @@
     </w:p>
     <w:p>
       <w:r>
+        <w:rPr>
+          <w:noProof/>
+        </w:rPr>
         <w:drawing>
           <wp:inline distT="0" distB="0" distL="0" distR="0" wp14:anchorId="0C1658C6" wp14:editId="4B112C9D">
             <wp:extent cx="6645910" cy="1795145"/>

</xml_diff>